<commit_message>
Fix chart text positioning: tornado labels, gantt clipping, age annotation, legend spacing
- Tornado: use min/max offsets to ensure labels never overlap bars,
  even for small-range variables; wider figure (12in)
- Gantt: wider figure (14in), extended xlim to 170, increased bar
  threshold to 20 months for outside-text placement
- Age distribution: move "53% of operators" annotation below the
  bars (y=25) instead of overlapping with chart title
- Leading indicators: widen canvas to 14, increase legend spacing
  from 1.5 to 2.0 units between items

https://claude.ai/code/session_011F2ZpxHnuQ8BtRbwuEkG6H
</commit_message>
<xml_diff>
--- a/PLMA_Price_Market_Strategy_2026.docx
+++ b/PLMA_Price_Market_Strategy_2026.docx
@@ -3148,7 +3148,7 @@
       <w:r>
         <w:drawing>
           <wp:inline xmlns:a="http://schemas.openxmlformats.org/drawingml/2006/main" xmlns:pic="http://schemas.openxmlformats.org/drawingml/2006/picture">
-            <wp:extent cx="5943600" cy="3804751"/>
+            <wp:extent cx="5943600" cy="3595511"/>
             <wp:docPr id="7" name="Picture 7"/>
             <wp:cNvGraphicFramePr>
               <a:graphicFrameLocks noChangeAspect="1"/>
@@ -3169,7 +3169,7 @@
                   <pic:spPr>
                     <a:xfrm>
                       <a:off x="0" y="0"/>
-                      <a:ext cx="5943600" cy="3804751"/>
+                      <a:ext cx="5943600" cy="3595511"/>
                     </a:xfrm>
                     <a:prstGeom prst="rect"/>
                   </pic:spPr>
@@ -4189,7 +4189,7 @@
       <w:r>
         <w:drawing>
           <wp:inline xmlns:a="http://schemas.openxmlformats.org/drawingml/2006/main" xmlns:pic="http://schemas.openxmlformats.org/drawingml/2006/picture">
-            <wp:extent cx="5943600" cy="4347393"/>
+            <wp:extent cx="5943600" cy="4191802"/>
             <wp:docPr id="10" name="Picture 10"/>
             <wp:cNvGraphicFramePr>
               <a:graphicFrameLocks noChangeAspect="1"/>
@@ -4210,7 +4210,7 @@
                   <pic:spPr>
                     <a:xfrm>
                       <a:off x="0" y="0"/>
-                      <a:ext cx="5943600" cy="4347393"/>
+                      <a:ext cx="5943600" cy="4191802"/>
                     </a:xfrm>
                     <a:prstGeom prst="rect"/>
                   </pic:spPr>
@@ -6072,7 +6072,7 @@
       <w:r>
         <w:drawing>
           <wp:inline xmlns:a="http://schemas.openxmlformats.org/drawingml/2006/main" xmlns:pic="http://schemas.openxmlformats.org/drawingml/2006/picture">
-            <wp:extent cx="5943600" cy="3809760"/>
+            <wp:extent cx="5943600" cy="3483164"/>
             <wp:docPr id="11" name="Picture 11"/>
             <wp:cNvGraphicFramePr>
               <a:graphicFrameLocks noChangeAspect="1"/>
@@ -6093,7 +6093,7 @@
                   <pic:spPr>
                     <a:xfrm>
                       <a:off x="0" y="0"/>
-                      <a:ext cx="5943600" cy="3809760"/>
+                      <a:ext cx="5943600" cy="3483164"/>
                     </a:xfrm>
                     <a:prstGeom prst="rect"/>
                   </pic:spPr>
@@ -8632,7 +8632,7 @@
       <w:r>
         <w:drawing>
           <wp:inline xmlns:a="http://schemas.openxmlformats.org/drawingml/2006/main" xmlns:pic="http://schemas.openxmlformats.org/drawingml/2006/picture">
-            <wp:extent cx="5943600" cy="3189099"/>
+            <wp:extent cx="5943600" cy="2752547"/>
             <wp:docPr id="14" name="Picture 14"/>
             <wp:cNvGraphicFramePr>
               <a:graphicFrameLocks noChangeAspect="1"/>
@@ -8653,7 +8653,7 @@
                   <pic:spPr>
                     <a:xfrm>
                       <a:off x="0" y="0"/>
-                      <a:ext cx="5943600" cy="3189099"/>
+                      <a:ext cx="5943600" cy="2752547"/>
                     </a:xfrm>
                     <a:prstGeom prst="rect"/>
                   </pic:spPr>

</xml_diff>

<commit_message>
Fix 3 charts: indicators align under legend, gantt clip at 140, tornado data-coord labels
1. Leading Indicators: Values now placed under their status column
   (On Track at x=9.5, Watch at x=11, Action Required at x=12.5).
   Each value aligns directly under its legend header. Wider figure
   (14") for breathing room.

2. Three Horizons Gantt: Clip xlim at 140 months (was 165) per user
   request — tighter chart without wasted whitespace.

3. Sensitivity Tornado: Switch from offset-points to data-coordinate
   labels (ax.text with data_pad=1.5 units). Discount rate row now
   has labels at same consistent distance as all other rows — no
   more labels sitting on top of small bars.

https://claude.ai/code/session_011F2ZpxHnuQ8BtRbwuEkG6H
</commit_message>
<xml_diff>
--- a/PLMA_Price_Market_Strategy_2026.docx
+++ b/PLMA_Price_Market_Strategy_2026.docx
@@ -4189,7 +4189,7 @@
       <w:r>
         <w:drawing>
           <wp:inline xmlns:a="http://schemas.openxmlformats.org/drawingml/2006/main" xmlns:pic="http://schemas.openxmlformats.org/drawingml/2006/picture">
-            <wp:extent cx="5943600" cy="4191802"/>
+            <wp:extent cx="5943600" cy="3603812"/>
             <wp:docPr id="10" name="Picture 10"/>
             <wp:cNvGraphicFramePr>
               <a:graphicFrameLocks noChangeAspect="1"/>
@@ -4210,7 +4210,7 @@
                   <pic:spPr>
                     <a:xfrm>
                       <a:off x="0" y="0"/>
-                      <a:ext cx="5943600" cy="4191802"/>
+                      <a:ext cx="5943600" cy="3603812"/>
                     </a:xfrm>
                     <a:prstGeom prst="rect"/>
                   </pic:spPr>
@@ -6072,7 +6072,7 @@
       <w:r>
         <w:drawing>
           <wp:inline xmlns:a="http://schemas.openxmlformats.org/drawingml/2006/main" xmlns:pic="http://schemas.openxmlformats.org/drawingml/2006/picture">
-            <wp:extent cx="5943600" cy="4110911"/>
+            <wp:extent cx="5943600" cy="4080540"/>
             <wp:docPr id="11" name="Picture 11"/>
             <wp:cNvGraphicFramePr>
               <a:graphicFrameLocks noChangeAspect="1"/>
@@ -6093,7 +6093,7 @@
                   <pic:spPr>
                     <a:xfrm>
                       <a:off x="0" y="0"/>
-                      <a:ext cx="5943600" cy="4110911"/>
+                      <a:ext cx="5943600" cy="4080540"/>
                     </a:xfrm>
                     <a:prstGeom prst="rect"/>
                   </pic:spPr>

</xml_diff>